<commit_message>
Revert to Claude 4.7/4.6 models (v1.6)
Revert model generations across all agents: claude-opus-5 → claude-opus-4-7 (CTO, Tech Lead, Code Migrator), claude-sonnet-5 → claude-sonnet-4-6 (16 other agents). Synchronizes CLAUDE.md §13.1/§13.1b/§18.5, CORE.md §7, writing-agent-skill.md, and agents-view.html. Haiku tier (§13.1b) unchanged. Adds v1.6 entry to changelog documenting the revert per user request.
</commit_message>
<xml_diff>
--- a/docs/SETUP-GLOBAL.docx
+++ b/docs/SETUP-GLOBAL.docx
@@ -608,6 +608,99 @@
     </w:p>
     <w:p>
       <w:pPr>
+        <w:spacing w:before="40" w:after="40"/>
+        <w:ind w:left="567"/>
+        <w:pBdr>
+          <w:left w:val="single" w:sz="12" w:space="10" w:color="F05922"/>
+        </w:pBdr>
+      </w:pPr>
+      <w:r>
+        <w:rPr>
+          <w:b/>
+          <w:color w:val="4A3F8C"/>
+        </w:rPr>
+        <w:t>Lessons Learned:</w:t>
+      </w:r>
+      <w:r>
+        <w:rPr>
+          <w:color w:val="4A3F8C"/>
+        </w:rPr>
+        <w:t xml:space="preserve"> </w:t>
+      </w:r>
+      <w:r>
+        <w:rPr>
+          <w:rFonts w:ascii="Courier New" w:hAnsi="Courier New"/>
+          <w:color w:val="F05922"/>
+          <w:sz w:val="18"/>
+        </w:rPr>
+        <w:t>~/.claude/lessons/</w:t>
+      </w:r>
+      <w:r>
+        <w:rPr>
+          <w:color w:val="4A3F8C"/>
+        </w:rPr>
+        <w:t xml:space="preserve"> (kinh nghiệm/gotcha kỹ thuật theo dự án — Avalonia, WinForms, camera SDK...)</w:t>
+      </w:r>
+    </w:p>
+    <w:p>
+      <w:pPr>
+        <w:spacing w:before="40" w:after="40"/>
+        <w:ind w:left="567"/>
+        <w:pBdr>
+          <w:left w:val="single" w:sz="12" w:space="10" w:color="F05922"/>
+        </w:pBdr>
+      </w:pPr>
+      <w:r>
+        <w:rPr>
+          <w:color w:val="4A3F8C"/>
+        </w:rPr>
+        <w:t xml:space="preserve">trước đây là thư mục </w:t>
+      </w:r>
+      <w:r>
+        <w:rPr>
+          <w:b/>
+          <w:color w:val="4A3F8C"/>
+        </w:rPr>
+        <w:t>thật, chỉ nằm trên máy, không có trong git</w:t>
+      </w:r>
+      <w:r>
+        <w:rPr>
+          <w:color w:val="4A3F8C"/>
+        </w:rPr>
+        <w:t xml:space="preserve"> — không backup, không đồng bộ máy khác.</w:t>
+      </w:r>
+    </w:p>
+    <w:p>
+      <w:pPr>
+        <w:spacing w:before="40" w:after="40"/>
+        <w:ind w:left="567"/>
+        <w:pBdr>
+          <w:left w:val="single" w:sz="12" w:space="10" w:color="F05922"/>
+        </w:pBdr>
+      </w:pPr>
+      <w:r>
+        <w:rPr>
+          <w:color w:val="4A3F8C"/>
+        </w:rPr>
+        <w:t>Từ 2026-07-27 đã chuyển vào repo (</w:t>
+      </w:r>
+      <w:r>
+        <w:rPr>
+          <w:rFonts w:ascii="Courier New" w:hAnsi="Courier New"/>
+          <w:color w:val="F05922"/>
+          <w:sz w:val="18"/>
+        </w:rPr>
+        <w:t>.claude/lessons/</w:t>
+      </w:r>
+      <w:r>
+        <w:rPr>
+          <w:color w:val="4A3F8C"/>
+        </w:rPr>
+        <w:t>) và junction như 8 mục còn lại (xem bảng §3).</w:t>
+      </w:r>
+    </w:p>
+    <w:p>
+      <w:pPr>
         <w:spacing w:before="80" w:after="80"/>
         <w:ind w:left="283"/>
         <w:shd w:val="clear" w:color="auto" w:fill="F4F4F8"/>
@@ -903,7 +996,7 @@
           <w:color w:val="F05922"/>
           <w:sz w:val="28"/>
         </w:rPr>
-        <w:t>3. Bảng 8 junction</w:t>
+        <w:t>3. Bảng 9 junction</w:t>
       </w:r>
     </w:p>
     <w:tbl>
@@ -1602,6 +1695,72 @@
                 <w:sz w:val="20"/>
               </w:rPr>
               <w:t>, linux-deb, kiosk...</w:t>
+            </w:r>
+          </w:p>
+        </w:tc>
+      </w:tr>
+      <w:tr>
+        <w:tc>
+          <w:tcPr>
+            <w:tcW w:type="dxa" w:w="3230"/>
+            <w:shd w:val="clear" w:color="auto" w:fill="B8B3D6"/>
+            <w:tcBorders>
+              <w:top w:val="single" w:sz="4" w:space="0" w:color="CBCBCB"/>
+              <w:left w:val="single" w:sz="4" w:space="0" w:color="CBCBCB"/>
+              <w:bottom w:val="single" w:sz="4" w:space="0" w:color="CBCBCB"/>
+              <w:right w:val="single" w:sz="4" w:space="0" w:color="CBCBCB"/>
+            </w:tcBorders>
+          </w:tcPr>
+          <w:p>
+            <w:r>
+              <w:rPr>
+                <w:rFonts w:ascii="Courier New" w:hAnsi="Courier New"/>
+                <w:color w:val="F05922"/>
+                <w:sz w:val="20"/>
+              </w:rPr>
+              <w:t>lessons</w:t>
+            </w:r>
+          </w:p>
+        </w:tc>
+        <w:tc>
+          <w:tcPr>
+            <w:tcW w:type="dxa" w:w="3230"/>
+            <w:shd w:val="clear" w:color="auto" w:fill="B8B3D6"/>
+            <w:tcBorders>
+              <w:top w:val="single" w:sz="4" w:space="0" w:color="CBCBCB"/>
+              <w:left w:val="single" w:sz="4" w:space="0" w:color="CBCBCB"/>
+              <w:bottom w:val="single" w:sz="4" w:space="0" w:color="CBCBCB"/>
+              <w:right w:val="single" w:sz="4" w:space="0" w:color="CBCBCB"/>
+            </w:tcBorders>
+          </w:tcPr>
+          <w:p>
+            <w:r>
+              <w:rPr>
+                <w:rFonts w:ascii="Courier New" w:hAnsi="Courier New"/>
+                <w:color w:val="F05922"/>
+                <w:sz w:val="20"/>
+              </w:rPr>
+              <w:t>.claude/lessons</w:t>
+            </w:r>
+          </w:p>
+        </w:tc>
+        <w:tc>
+          <w:tcPr>
+            <w:tcW w:type="dxa" w:w="3230"/>
+            <w:shd w:val="clear" w:color="auto" w:fill="B8B3D6"/>
+            <w:tcBorders>
+              <w:top w:val="single" w:sz="4" w:space="0" w:color="CBCBCB"/>
+              <w:left w:val="single" w:sz="4" w:space="0" w:color="CBCBCB"/>
+              <w:bottom w:val="single" w:sz="4" w:space="0" w:color="CBCBCB"/>
+              <w:right w:val="single" w:sz="4" w:space="0" w:color="CBCBCB"/>
+            </w:tcBorders>
+          </w:tcPr>
+          <w:p>
+            <w:r>
+              <w:rPr>
+                <w:sz w:val="20"/>
+              </w:rPr>
+              <w:t>Kinh nghiệm/gotcha kỹ thuật theo category (avalonia, csharp-winforms, camera-integration...) — chuyển vào repo 2026-07-27, trước đó là thư mục thật chỉ có trên máy</w:t>
             </w:r>
           </w:p>
         </w:tc>
@@ -3310,6 +3469,107 @@
           </w:p>
         </w:tc>
       </w:tr>
+      <w:tr>
+        <w:tc>
+          <w:tcPr>
+            <w:tcW w:type="dxa" w:w="3230"/>
+            <w:tcBorders>
+              <w:top w:val="single" w:sz="4" w:space="0" w:color="CBCBCB"/>
+              <w:left w:val="single" w:sz="4" w:space="0" w:color="CBCBCB"/>
+              <w:bottom w:val="single" w:sz="4" w:space="0" w:color="CBCBCB"/>
+              <w:right w:val="single" w:sz="4" w:space="0" w:color="CBCBCB"/>
+            </w:tcBorders>
+          </w:tcPr>
+          <w:p>
+            <w:r>
+              <w:rPr>
+                <w:sz w:val="20"/>
+              </w:rPr>
+              <w:t>2026-07-27</w:t>
+            </w:r>
+          </w:p>
+        </w:tc>
+        <w:tc>
+          <w:tcPr>
+            <w:tcW w:type="dxa" w:w="3230"/>
+            <w:tcBorders>
+              <w:top w:val="single" w:sz="4" w:space="0" w:color="CBCBCB"/>
+              <w:left w:val="single" w:sz="4" w:space="0" w:color="CBCBCB"/>
+              <w:bottom w:val="single" w:sz="4" w:space="0" w:color="CBCBCB"/>
+              <w:right w:val="single" w:sz="4" w:space="0" w:color="CBCBCB"/>
+            </w:tcBorders>
+          </w:tcPr>
+          <w:p>
+            <w:r>
+              <w:rPr>
+                <w:sz w:val="20"/>
+              </w:rPr>
+              <w:t xml:space="preserve">Thêm junction thứ 9 </w:t>
+            </w:r>
+            <w:r>
+              <w:rPr>
+                <w:rFonts w:ascii="Courier New" w:hAnsi="Courier New"/>
+                <w:color w:val="F05922"/>
+                <w:sz w:val="20"/>
+              </w:rPr>
+              <w:t>lessons</w:t>
+            </w:r>
+            <w:r>
+              <w:rPr>
+                <w:sz w:val="20"/>
+              </w:rPr>
+              <w:t xml:space="preserve"> — chuyển </w:t>
+            </w:r>
+            <w:r>
+              <w:rPr>
+                <w:rFonts w:ascii="Courier New" w:hAnsi="Courier New"/>
+                <w:color w:val="F05922"/>
+                <w:sz w:val="20"/>
+              </w:rPr>
+              <w:t>~/.claude/lessons/</w:t>
+            </w:r>
+            <w:r>
+              <w:rPr>
+                <w:sz w:val="20"/>
+              </w:rPr>
+              <w:t xml:space="preserve"> (429 file, ~87MB, trước đó là thư mục thật chỉ có trên máy, không backup/không đồng bộ) vào </w:t>
+            </w:r>
+            <w:r>
+              <w:rPr>
+                <w:rFonts w:ascii="Courier New" w:hAnsi="Courier New"/>
+                <w:color w:val="F05922"/>
+                <w:sz w:val="20"/>
+              </w:rPr>
+              <w:t>.claude/lessons/</w:t>
+            </w:r>
+            <w:r>
+              <w:rPr>
+                <w:sz w:val="20"/>
+              </w:rPr>
+              <w:t xml:space="preserve"> trong repo</w:t>
+            </w:r>
+          </w:p>
+        </w:tc>
+        <w:tc>
+          <w:tcPr>
+            <w:tcW w:type="dxa" w:w="3230"/>
+            <w:tcBorders>
+              <w:top w:val="single" w:sz="4" w:space="0" w:color="CBCBCB"/>
+              <w:left w:val="single" w:sz="4" w:space="0" w:color="CBCBCB"/>
+              <w:bottom w:val="single" w:sz="4" w:space="0" w:color="CBCBCB"/>
+              <w:right w:val="single" w:sz="4" w:space="0" w:color="CBCBCB"/>
+            </w:tcBorders>
+          </w:tcPr>
+          <w:p>
+            <w:r>
+              <w:rPr>
+                <w:sz w:val="20"/>
+              </w:rPr>
+              <w:t>Claude Code</w:t>
+            </w:r>
+          </w:p>
+        </w:tc>
+      </w:tr>
     </w:tbl>
     <w:p/>
     <w:sectPr>

</xml_diff>

<commit_message>
Bổ sung README graphify + đưa hook code-graph reminder vào repo dùng chung
- docs/GRAPHIFY-GUIDE.md (+docx/pdf): hướng dẫn đầy đủ cài đặt/dùng graphify,
  bảng lệnh tham khảo, 2 tầng hook (global reminder + project query-guard +
  auto-update), và bảng quyết định "có nên đẩy lên git" theo đúng repo sở hữu
  từng file.
- .claude/hooks/code-graph-lesson-reminder.js: dời từ ~/.claude/hooks/ (trước
  đây cố ý để ngoài git) vào repo, junction qua hooks-kztek/ — không còn mất
  khi đổi máy. Cập nhật settings.json thật + template settings-global.json
  trỏ về đường dẫn junction mới.
- docs/SETUP-GLOBAL.md: cập nhật bảng 9 junction + ghi chú lý do đổi thiết kế.
- Gộp lesson graphify-hook-silent-fail-scripts-not-in-path.md (ghi trong lúc
  thiết lập ở App-Access-V2) + cập nhật INDEX.md/LESSONS-LOG.md tương ứng.

Co-Authored-By: Claude Sonnet 5 <noreply@anthropic.com>
</commit_message>
<xml_diff>
--- a/docs/SETUP-GLOBAL.docx
+++ b/docs/SETUP-GLOBAL.docx
@@ -1619,6 +1619,20 @@
               </w:rPr>
               <w:t>config-protection.js</w:t>
             </w:r>
+            <w:r>
+              <w:rPr>
+                <w:sz w:val="20"/>
+              </w:rPr>
+              <w:t xml:space="preserve">, </w:t>
+            </w:r>
+            <w:r>
+              <w:rPr>
+                <w:rFonts w:ascii="Courier New" w:hAnsi="Courier New"/>
+                <w:color w:val="F05922"/>
+                <w:sz w:val="20"/>
+              </w:rPr>
+              <w:t>code-graph-lesson-reminder.js</w:t>
+            </w:r>
           </w:p>
         </w:tc>
       </w:tr>
@@ -1782,7 +1796,7 @@
         <w:rPr>
           <w:sz w:val="21"/>
         </w:rPr>
-        <w:t xml:space="preserve"> </w:t>
+        <w:t xml:space="preserve"> ban đầu (2026-07-25) </w:t>
       </w:r>
       <w:r>
         <w:rPr>
@@ -1796,7 +1810,7 @@
         <w:rPr>
           <w:sz w:val="21"/>
         </w:rPr>
-        <w:t xml:space="preserve"> đã có hook riêng của máy</w:t>
+        <w:t xml:space="preserve"> có</w:t>
       </w:r>
     </w:p>
     <w:p>
@@ -1807,7 +1821,7 @@
         <w:rPr>
           <w:sz w:val="21"/>
         </w:rPr>
-        <w:t>(</w:t>
+        <w:t>hook riêng của máy (</w:t>
       </w:r>
       <w:r>
         <w:rPr>
@@ -1821,7 +1835,109 @@
         <w:rPr>
           <w:sz w:val="21"/>
         </w:rPr>
-        <w:t>) không thuộc repo này. Dùng tên khác để hai bộ cùng tồn tại.</w:t>
+        <w:t>) không thuộc repo này, nên dùng tên khác để</w:t>
+      </w:r>
+    </w:p>
+    <w:p>
+      <w:pPr>
+        <w:spacing w:after="80"/>
+      </w:pPr>
+      <w:r>
+        <w:rPr>
+          <w:sz w:val="21"/>
+        </w:rPr>
+        <w:t>hai bộ cùng tồn tại. Từ 2026-07-29, hook đó đã được đưa vào repo (</w:t>
+      </w:r>
+      <w:r>
+        <w:rPr>
+          <w:rFonts w:ascii="Courier New" w:hAnsi="Courier New"/>
+          <w:color w:val="F05922"/>
+          <w:sz w:val="18"/>
+        </w:rPr>
+        <w:t>.claude/hooks/</w:t>
+      </w:r>
+      <w:r>
+        <w:rPr>
+          <w:sz w:val="21"/>
+        </w:rPr>
+        <w:t>, junction qua</w:t>
+      </w:r>
+    </w:p>
+    <w:p>
+      <w:pPr>
+        <w:spacing w:after="80"/>
+      </w:pPr>
+      <w:r>
+        <w:rPr>
+          <w:rFonts w:ascii="Courier New" w:hAnsi="Courier New"/>
+          <w:color w:val="F05922"/>
+          <w:sz w:val="18"/>
+        </w:rPr>
+        <w:t>hooks-kztek</w:t>
+      </w:r>
+      <w:r>
+        <w:rPr>
+          <w:sz w:val="21"/>
+        </w:rPr>
+        <w:t xml:space="preserve">) để không mất khi đổi máy — xem Lịch sử cập nhật cuối file. Tên </w:t>
+      </w:r>
+      <w:r>
+        <w:rPr>
+          <w:rFonts w:ascii="Courier New" w:hAnsi="Courier New"/>
+          <w:color w:val="F05922"/>
+          <w:sz w:val="18"/>
+        </w:rPr>
+        <w:t>hooks-kztek</w:t>
+      </w:r>
+      <w:r>
+        <w:rPr>
+          <w:sz w:val="21"/>
+        </w:rPr>
+        <w:t xml:space="preserve"> vẫn giữ</w:t>
+      </w:r>
+    </w:p>
+    <w:p>
+      <w:pPr>
+        <w:spacing w:after="80"/>
+      </w:pPr>
+      <w:r>
+        <w:rPr>
+          <w:sz w:val="21"/>
+        </w:rPr>
+        <w:t xml:space="preserve">nguyên (không đổi lại thành </w:t>
+      </w:r>
+      <w:r>
+        <w:rPr>
+          <w:rFonts w:ascii="Courier New" w:hAnsi="Courier New"/>
+          <w:color w:val="F05922"/>
+          <w:sz w:val="18"/>
+        </w:rPr>
+        <w:t>hooks</w:t>
+      </w:r>
+      <w:r>
+        <w:rPr>
+          <w:sz w:val="21"/>
+        </w:rPr>
+        <w:t xml:space="preserve">) để tránh phá vỡ đường dẫn đã cấu hình trong </w:t>
+      </w:r>
+      <w:r>
+        <w:rPr>
+          <w:rFonts w:ascii="Courier New" w:hAnsi="Courier New"/>
+          <w:color w:val="F05922"/>
+          <w:sz w:val="18"/>
+        </w:rPr>
+        <w:t>settings.json</w:t>
+      </w:r>
+    </w:p>
+    <w:p>
+      <w:pPr>
+        <w:spacing w:after="80"/>
+      </w:pPr>
+      <w:r>
+        <w:rPr>
+          <w:sz w:val="21"/>
+        </w:rPr>
+        <w:t>hiện có trên các máy khác.</w:t>
       </w:r>
     </w:p>
     <w:p>
@@ -3570,6 +3686,166 @@
           </w:p>
         </w:tc>
       </w:tr>
+      <w:tr>
+        <w:tc>
+          <w:tcPr>
+            <w:tcW w:type="dxa" w:w="3230"/>
+            <w:shd w:val="clear" w:color="auto" w:fill="B8B3D6"/>
+            <w:tcBorders>
+              <w:top w:val="single" w:sz="4" w:space="0" w:color="CBCBCB"/>
+              <w:left w:val="single" w:sz="4" w:space="0" w:color="CBCBCB"/>
+              <w:bottom w:val="single" w:sz="4" w:space="0" w:color="CBCBCB"/>
+              <w:right w:val="single" w:sz="4" w:space="0" w:color="CBCBCB"/>
+            </w:tcBorders>
+          </w:tcPr>
+          <w:p>
+            <w:r>
+              <w:rPr>
+                <w:sz w:val="20"/>
+              </w:rPr>
+              <w:t>2026-07-29</w:t>
+            </w:r>
+          </w:p>
+        </w:tc>
+        <w:tc>
+          <w:tcPr>
+            <w:tcW w:type="dxa" w:w="3230"/>
+            <w:shd w:val="clear" w:color="auto" w:fill="B8B3D6"/>
+            <w:tcBorders>
+              <w:top w:val="single" w:sz="4" w:space="0" w:color="CBCBCB"/>
+              <w:left w:val="single" w:sz="4" w:space="0" w:color="CBCBCB"/>
+              <w:bottom w:val="single" w:sz="4" w:space="0" w:color="CBCBCB"/>
+              <w:right w:val="single" w:sz="4" w:space="0" w:color="CBCBCB"/>
+            </w:tcBorders>
+          </w:tcPr>
+          <w:p>
+            <w:r>
+              <w:rPr>
+                <w:sz w:val="20"/>
+              </w:rPr>
+              <w:t xml:space="preserve">Đưa </w:t>
+            </w:r>
+            <w:r>
+              <w:rPr>
+                <w:rFonts w:ascii="Courier New" w:hAnsi="Courier New"/>
+                <w:color w:val="F05922"/>
+                <w:sz w:val="20"/>
+              </w:rPr>
+              <w:t>code-graph-lesson-reminder.js</w:t>
+            </w:r>
+            <w:r>
+              <w:rPr>
+                <w:sz w:val="20"/>
+              </w:rPr>
+              <w:t xml:space="preserve"> (hook </w:t>
+            </w:r>
+            <w:r>
+              <w:rPr>
+                <w:rFonts w:ascii="Courier New" w:hAnsi="Courier New"/>
+                <w:color w:val="F05922"/>
+                <w:sz w:val="20"/>
+              </w:rPr>
+              <w:t>PostToolUse</w:t>
+            </w:r>
+            <w:r>
+              <w:rPr>
+                <w:sz w:val="20"/>
+              </w:rPr>
+              <w:t xml:space="preserve"> nhắc cập nhật CODE-GRAPH/lesson) vào </w:t>
+            </w:r>
+            <w:r>
+              <w:rPr>
+                <w:rFonts w:ascii="Courier New" w:hAnsi="Courier New"/>
+                <w:color w:val="F05922"/>
+                <w:sz w:val="20"/>
+              </w:rPr>
+              <w:t>.claude/hooks/</w:t>
+            </w:r>
+            <w:r>
+              <w:rPr>
+                <w:sz w:val="20"/>
+              </w:rPr>
+              <w:t xml:space="preserve"> của repo — trước đó là hook riêng của máy, không tracked. Cập nhật </w:t>
+            </w:r>
+            <w:r>
+              <w:rPr>
+                <w:rFonts w:ascii="Courier New" w:hAnsi="Courier New"/>
+                <w:color w:val="F05922"/>
+                <w:sz w:val="20"/>
+              </w:rPr>
+              <w:t>settings.json</w:t>
+            </w:r>
+            <w:r>
+              <w:rPr>
+                <w:sz w:val="20"/>
+              </w:rPr>
+              <w:t xml:space="preserve"> thật + template </w:t>
+            </w:r>
+            <w:r>
+              <w:rPr>
+                <w:rFonts w:ascii="Courier New" w:hAnsi="Courier New"/>
+                <w:color w:val="F05922"/>
+                <w:sz w:val="20"/>
+              </w:rPr>
+              <w:t>settings-global.json</w:t>
+            </w:r>
+            <w:r>
+              <w:rPr>
+                <w:sz w:val="20"/>
+              </w:rPr>
+              <w:t xml:space="preserve"> trỏ về </w:t>
+            </w:r>
+            <w:r>
+              <w:rPr>
+                <w:rFonts w:ascii="Courier New" w:hAnsi="Courier New"/>
+                <w:color w:val="F05922"/>
+                <w:sz w:val="20"/>
+              </w:rPr>
+              <w:t>hooks-kztek/</w:t>
+            </w:r>
+            <w:r>
+              <w:rPr>
+                <w:sz w:val="20"/>
+              </w:rPr>
+              <w:t xml:space="preserve"> thay vì </w:t>
+            </w:r>
+            <w:r>
+              <w:rPr>
+                <w:rFonts w:ascii="Courier New" w:hAnsi="Courier New"/>
+                <w:color w:val="F05922"/>
+                <w:sz w:val="20"/>
+              </w:rPr>
+              <w:t>hooks/</w:t>
+            </w:r>
+            <w:r>
+              <w:rPr>
+                <w:sz w:val="20"/>
+              </w:rPr>
+              <w:t>. Lý do đổi: user muốn giữ thiết lập khi đổi máy, không muốn phải tạo lại thủ công</w:t>
+            </w:r>
+          </w:p>
+        </w:tc>
+        <w:tc>
+          <w:tcPr>
+            <w:tcW w:type="dxa" w:w="3230"/>
+            <w:shd w:val="clear" w:color="auto" w:fill="B8B3D6"/>
+            <w:tcBorders>
+              <w:top w:val="single" w:sz="4" w:space="0" w:color="CBCBCB"/>
+              <w:left w:val="single" w:sz="4" w:space="0" w:color="CBCBCB"/>
+              <w:bottom w:val="single" w:sz="4" w:space="0" w:color="CBCBCB"/>
+              <w:right w:val="single" w:sz="4" w:space="0" w:color="CBCBCB"/>
+            </w:tcBorders>
+          </w:tcPr>
+          <w:p>
+            <w:r>
+              <w:rPr>
+                <w:sz w:val="20"/>
+              </w:rPr>
+              <w:t>Claude Code</w:t>
+            </w:r>
+          </w:p>
+        </w:tc>
+      </w:tr>
     </w:tbl>
     <w:p/>
     <w:sectPr>

</xml_diff>